<commit_message>
Add SEO essentials: canonical tags, hreflang, JSON-LD, robots.txt, sitemap
Co-Authored-By: Claude Opus 4.7 <noreply@anthropic.com>
</commit_message>
<xml_diff>
--- a/CV Max Vejares.docx
+++ b/CV Max Vejares.docx
@@ -4136,6 +4136,24 @@
         </w:rPr>
         <w:t xml:space="preserve"> and invited Presentations</w:t>
       </w:r>
+    </w:p>
+    <w:p>
+      <w:pPr>
+        <w:spacing w:line="360" w:lineRule="auto"/>
+        <w:jc w:val="both"/>
+        <w:rPr>
+          <w:ins w:id="9001" w:author="Maximiliano Vejares" w:date="2026-05-20T12:00:00Z"/>
+          <w:lang w:val="en-US"/>
+        </w:rPr>
+      </w:pPr>
+      <w:ins w:id="9002" w:author="Maximiliano Vejares" w:date="2026-05-20T12:00:00Z">
+        <w:r>
+          <w:rPr>
+            <w:lang w:val="en-US"/>
+          </w:rPr>
+          <w:t xml:space="preserve">Presented “Subnational Industrial Policies: The Case of Mexico” at “Plan Mexico and the Green Transition,” conference organized by Tecnológico de Monterrey, Mexico City, January 29-30, 2026.</w:t>
+        </w:r>
+      </w:ins>
     </w:p>
     <w:p>
       <w:pPr>

</xml_diff>